<commit_message>
Deploy preview for PR 9 🛫
</commit_message>
<xml_diff>
--- a/pr-preview/pr-9/chapters/chapter1-tracked-changes.docx
+++ b/pr-preview/pr-9/chapters/chapter1-tracked-changes.docx
@@ -537,7 +537,7 @@
         <w:t xml:space="preserve"> </w:t>
       </w:r>
       <w:r>
-        <w:t xml:space="preserve">b98e72e</w:t>
+        <w:t xml:space="preserve">c42516e</w:t>
       </w:r>
     </w:p>
     <w:p>
@@ -559,7 +559,7 @@
         <w:t xml:space="preserve"> </w:t>
       </w:r>
       <w:r>
-        <w:t xml:space="preserve">b98e72e68fa2c56ad957274f9277242483bf25b2</w:t>
+        <w:t xml:space="preserve">c42516e43a1564b579295a715281e30681aa9d64</w:t>
       </w:r>
     </w:p>
     <w:p>
@@ -581,7 +581,7 @@
         <w:t xml:space="preserve"> </w:t>
       </w:r>
       <w:r>
-        <w:t xml:space="preserve">2026-04-08 21:29:12 +0000</w:t>
+        <w:t xml:space="preserve">2026-04-08 14:34:39 -0700</w:t>
       </w:r>
     </w:p>
     <w:p>

</xml_diff>